<commit_message>
HW5: add GRANT migration, update backend documentation after Supabase deploy
Co-Authored-By: Claude Sonnet 5.5 <noreply@anthropic.com>
</commit_message>
<xml_diff>
--- a/Отчёты_ДЗ/ДЗ1_Сравнение_AI-инструментов.docx
+++ b/Отчёты_ДЗ/ДЗ1_Сравнение_AI-инструментов.docx
@@ -4795,9 +4795,18 @@
           <w:ilvl w:val="0"/>
           <w:numId w:val="2"/>
         </w:numPr>
-      </w:pPr>
-      <w:r>
-        <w:t>ОС: Windows 10, Node.js 24, npm 11, Git.</w:t>
+        <w:rPr>
+          <w:lang w:val="en-US"/>
+        </w:rPr>
+      </w:pPr>
+      <w:r>
+        <w:t>ОС</w:t>
+      </w:r>
+      <w:r>
+        <w:rPr>
+          <w:lang w:val="en-US"/>
+        </w:rPr>
+        <w:t>: Windows 10, Node.js 24, npm 11, Git.</w:t>
       </w:r>
     </w:p>
     <w:p>
@@ -5205,10 +5214,16 @@
             </w:tcMar>
           </w:tcPr>
           <w:p>
+            <w:pPr>
+              <w:rPr>
+                <w:lang w:val="en-US"/>
+              </w:rPr>
+            </w:pPr>
             <w:r>
               <w:rPr>
                 <w:sz w:val="20"/>
                 <w:szCs w:val="20"/>
+                <w:lang w:val="en-US"/>
               </w:rPr>
               <w:t>2 (</w:t>
             </w:r>
@@ -5217,6 +5232,7 @@
                 <w:rFonts w:ascii="Consolas" w:eastAsia="Consolas" w:hAnsi="Consolas" w:cs="Consolas"/>
                 <w:sz w:val="18"/>
                 <w:szCs w:val="18"/>
+                <w:lang w:val="en-US"/>
               </w:rPr>
               <w:t>cart.js</w:t>
             </w:r>
@@ -5224,6 +5240,7 @@
               <w:rPr>
                 <w:sz w:val="20"/>
                 <w:szCs w:val="20"/>
+                <w:lang w:val="en-US"/>
               </w:rPr>
               <w:t xml:space="preserve">, </w:t>
             </w:r>
@@ -5232,6 +5249,7 @@
                 <w:rFonts w:ascii="Consolas" w:eastAsia="Consolas" w:hAnsi="Consolas" w:cs="Consolas"/>
                 <w:sz w:val="18"/>
                 <w:szCs w:val="18"/>
+                <w:lang w:val="en-US"/>
               </w:rPr>
               <w:t>cart.test.js</w:t>
             </w:r>
@@ -5239,6 +5257,7 @@
               <w:rPr>
                 <w:sz w:val="20"/>
                 <w:szCs w:val="20"/>
+                <w:lang w:val="en-US"/>
               </w:rPr>
               <w:t>)</w:t>
             </w:r>
@@ -5376,124 +5395,435 @@
       <w:pPr>
         <w:shd w:val="clear" w:color="auto" w:fill="F2F2F2"/>
         <w:ind w:left="240"/>
+        <w:rPr>
+          <w:lang w:val="en-US"/>
+        </w:rPr>
       </w:pPr>
       <w:r>
         <w:rPr>
           <w:rFonts w:ascii="Consolas" w:eastAsia="Consolas" w:hAnsi="Consolas" w:cs="Consolas"/>
           <w:sz w:val="18"/>
           <w:szCs w:val="18"/>
-        </w:rPr>
-        <w:t>function addToCart(cart, item, deliveryDate, today = new Date()) {</w:t>
-      </w:r>
-    </w:p>
-    <w:p>
-      <w:pPr>
-        <w:shd w:val="clear" w:color="auto" w:fill="F2F2F2"/>
-        <w:ind w:left="240"/>
-      </w:pPr>
+          <w:lang w:val="en-US"/>
+        </w:rPr>
+        <w:t xml:space="preserve">function </w:t>
+      </w:r>
+      <w:proofErr w:type="gramStart"/>
       <w:r>
         <w:rPr>
           <w:rFonts w:ascii="Consolas" w:eastAsia="Consolas" w:hAnsi="Consolas" w:cs="Consolas"/>
           <w:sz w:val="18"/>
           <w:szCs w:val="18"/>
-        </w:rPr>
-        <w:t xml:space="preserve">  if (!isDeliveryDateAllowed(deliveryDate, today)) {</w:t>
-      </w:r>
-    </w:p>
-    <w:p>
-      <w:pPr>
-        <w:shd w:val="clear" w:color="auto" w:fill="F2F2F2"/>
-        <w:ind w:left="240"/>
-      </w:pPr>
+          <w:lang w:val="en-US"/>
+        </w:rPr>
+        <w:t>addToCart(</w:t>
+      </w:r>
+      <w:proofErr w:type="gramEnd"/>
       <w:r>
         <w:rPr>
           <w:rFonts w:ascii="Consolas" w:eastAsia="Consolas" w:hAnsi="Consolas" w:cs="Consolas"/>
           <w:sz w:val="18"/>
           <w:szCs w:val="18"/>
-        </w:rPr>
-        <w:t xml:space="preserve">    throw new RangeError('Дата доставки не ранее чем через 2 дня');</w:t>
+          <w:lang w:val="en-US"/>
+        </w:rPr>
+        <w:t>cart, item, deliveryDate, today = new Date()) {</w:t>
       </w:r>
     </w:p>
     <w:p>
       <w:pPr>
         <w:shd w:val="clear" w:color="auto" w:fill="F2F2F2"/>
         <w:ind w:left="240"/>
+        <w:rPr>
+          <w:lang w:val="en-US"/>
+        </w:rPr>
       </w:pPr>
       <w:r>
         <w:rPr>
           <w:rFonts w:ascii="Consolas" w:eastAsia="Consolas" w:hAnsi="Consolas" w:cs="Consolas"/>
           <w:sz w:val="18"/>
           <w:szCs w:val="18"/>
-        </w:rPr>
-        <w:t xml:space="preserve">  }</w:t>
-      </w:r>
-    </w:p>
-    <w:p>
-      <w:pPr>
-        <w:shd w:val="clear" w:color="auto" w:fill="F2F2F2"/>
-        <w:ind w:left="240"/>
-      </w:pPr>
+          <w:lang w:val="en-US"/>
+        </w:rPr>
+        <w:t xml:space="preserve">  if </w:t>
+      </w:r>
+      <w:proofErr w:type="gramStart"/>
       <w:r>
         <w:rPr>
           <w:rFonts w:ascii="Consolas" w:eastAsia="Consolas" w:hAnsi="Consolas" w:cs="Consolas"/>
           <w:sz w:val="18"/>
           <w:szCs w:val="18"/>
-        </w:rPr>
-        <w:t xml:space="preserve">  const key = `${item.id}:${item.period}:${deliveryDate.toISOString().slice(0, 10)}`;</w:t>
-      </w:r>
-    </w:p>
-    <w:p>
-      <w:pPr>
-        <w:shd w:val="clear" w:color="auto" w:fill="F2F2F2"/>
-        <w:ind w:left="240"/>
-      </w:pPr>
+          <w:lang w:val="en-US"/>
+        </w:rPr>
+        <w:t>(!isDeliveryDateAllowed</w:t>
+      </w:r>
+      <w:proofErr w:type="gramEnd"/>
       <w:r>
         <w:rPr>
           <w:rFonts w:ascii="Consolas" w:eastAsia="Consolas" w:hAnsi="Consolas" w:cs="Consolas"/>
           <w:sz w:val="18"/>
           <w:szCs w:val="18"/>
-        </w:rPr>
-        <w:t xml:space="preserve">  const existing = cart.find((l) =&gt; l.key === key);</w:t>
+          <w:lang w:val="en-US"/>
+        </w:rPr>
+        <w:t>(deliveryDate, today)) {</w:t>
       </w:r>
     </w:p>
     <w:p>
       <w:pPr>
         <w:shd w:val="clear" w:color="auto" w:fill="F2F2F2"/>
         <w:ind w:left="240"/>
+        <w:rPr>
+          <w:lang w:val="en-US"/>
+        </w:rPr>
       </w:pPr>
       <w:r>
         <w:rPr>
           <w:rFonts w:ascii="Consolas" w:eastAsia="Consolas" w:hAnsi="Consolas" w:cs="Consolas"/>
           <w:sz w:val="18"/>
           <w:szCs w:val="18"/>
-        </w:rPr>
-        <w:t xml:space="preserve">  if (existing) return cart.map((l) =&gt; (l.key === key ? { ...l, qty: l.qty + 1 } : l));</w:t>
-      </w:r>
-    </w:p>
-    <w:p>
-      <w:pPr>
-        <w:shd w:val="clear" w:color="auto" w:fill="F2F2F2"/>
-        <w:ind w:left="240"/>
-      </w:pPr>
+          <w:lang w:val="en-US"/>
+        </w:rPr>
+        <w:t xml:space="preserve">    throw new </w:t>
+      </w:r>
+      <w:proofErr w:type="gramStart"/>
       <w:r>
         <w:rPr>
           <w:rFonts w:ascii="Consolas" w:eastAsia="Consolas" w:hAnsi="Consolas" w:cs="Consolas"/>
           <w:sz w:val="18"/>
           <w:szCs w:val="18"/>
-        </w:rPr>
-        <w:t xml:space="preserve">  return [...cart, { key, ...item, deliveryDate, qty: 1 }];</w:t>
-      </w:r>
-    </w:p>
-    <w:p>
-      <w:pPr>
-        <w:shd w:val="clear" w:color="auto" w:fill="F2F2F2"/>
-        <w:ind w:left="240"/>
-      </w:pPr>
+          <w:lang w:val="en-US"/>
+        </w:rPr>
+        <w:t>RangeError(</w:t>
+      </w:r>
+      <w:proofErr w:type="gramEnd"/>
       <w:r>
         <w:rPr>
           <w:rFonts w:ascii="Consolas" w:eastAsia="Consolas" w:hAnsi="Consolas" w:cs="Consolas"/>
           <w:sz w:val="18"/>
           <w:szCs w:val="18"/>
+          <w:lang w:val="en-US"/>
+        </w:rPr>
+        <w:t>'</w:t>
+      </w:r>
+      <w:r>
+        <w:rPr>
+          <w:rFonts w:ascii="Consolas" w:eastAsia="Consolas" w:hAnsi="Consolas" w:cs="Consolas"/>
+          <w:sz w:val="18"/>
+          <w:szCs w:val="18"/>
+        </w:rPr>
+        <w:t>Дата</w:t>
+      </w:r>
+      <w:r>
+        <w:rPr>
+          <w:rFonts w:ascii="Consolas" w:eastAsia="Consolas" w:hAnsi="Consolas" w:cs="Consolas"/>
+          <w:sz w:val="18"/>
+          <w:szCs w:val="18"/>
+          <w:lang w:val="en-US"/>
+        </w:rPr>
+        <w:t xml:space="preserve"> </w:t>
+      </w:r>
+      <w:r>
+        <w:rPr>
+          <w:rFonts w:ascii="Consolas" w:eastAsia="Consolas" w:hAnsi="Consolas" w:cs="Consolas"/>
+          <w:sz w:val="18"/>
+          <w:szCs w:val="18"/>
+        </w:rPr>
+        <w:t>доставки</w:t>
+      </w:r>
+      <w:r>
+        <w:rPr>
+          <w:rFonts w:ascii="Consolas" w:eastAsia="Consolas" w:hAnsi="Consolas" w:cs="Consolas"/>
+          <w:sz w:val="18"/>
+          <w:szCs w:val="18"/>
+          <w:lang w:val="en-US"/>
+        </w:rPr>
+        <w:t xml:space="preserve"> </w:t>
+      </w:r>
+      <w:r>
+        <w:rPr>
+          <w:rFonts w:ascii="Consolas" w:eastAsia="Consolas" w:hAnsi="Consolas" w:cs="Consolas"/>
+          <w:sz w:val="18"/>
+          <w:szCs w:val="18"/>
+        </w:rPr>
+        <w:t>не</w:t>
+      </w:r>
+      <w:r>
+        <w:rPr>
+          <w:rFonts w:ascii="Consolas" w:eastAsia="Consolas" w:hAnsi="Consolas" w:cs="Consolas"/>
+          <w:sz w:val="18"/>
+          <w:szCs w:val="18"/>
+          <w:lang w:val="en-US"/>
+        </w:rPr>
+        <w:t xml:space="preserve"> </w:t>
+      </w:r>
+      <w:r>
+        <w:rPr>
+          <w:rFonts w:ascii="Consolas" w:eastAsia="Consolas" w:hAnsi="Consolas" w:cs="Consolas"/>
+          <w:sz w:val="18"/>
+          <w:szCs w:val="18"/>
+        </w:rPr>
+        <w:t>ранее</w:t>
+      </w:r>
+      <w:r>
+        <w:rPr>
+          <w:rFonts w:ascii="Consolas" w:eastAsia="Consolas" w:hAnsi="Consolas" w:cs="Consolas"/>
+          <w:sz w:val="18"/>
+          <w:szCs w:val="18"/>
+          <w:lang w:val="en-US"/>
+        </w:rPr>
+        <w:t xml:space="preserve"> </w:t>
+      </w:r>
+      <w:r>
+        <w:rPr>
+          <w:rFonts w:ascii="Consolas" w:eastAsia="Consolas" w:hAnsi="Consolas" w:cs="Consolas"/>
+          <w:sz w:val="18"/>
+          <w:szCs w:val="18"/>
+        </w:rPr>
+        <w:t>чем</w:t>
+      </w:r>
+      <w:r>
+        <w:rPr>
+          <w:rFonts w:ascii="Consolas" w:eastAsia="Consolas" w:hAnsi="Consolas" w:cs="Consolas"/>
+          <w:sz w:val="18"/>
+          <w:szCs w:val="18"/>
+          <w:lang w:val="en-US"/>
+        </w:rPr>
+        <w:t xml:space="preserve"> </w:t>
+      </w:r>
+      <w:r>
+        <w:rPr>
+          <w:rFonts w:ascii="Consolas" w:eastAsia="Consolas" w:hAnsi="Consolas" w:cs="Consolas"/>
+          <w:sz w:val="18"/>
+          <w:szCs w:val="18"/>
+        </w:rPr>
+        <w:t>через</w:t>
+      </w:r>
+      <w:r>
+        <w:rPr>
+          <w:rFonts w:ascii="Consolas" w:eastAsia="Consolas" w:hAnsi="Consolas" w:cs="Consolas"/>
+          <w:sz w:val="18"/>
+          <w:szCs w:val="18"/>
+          <w:lang w:val="en-US"/>
+        </w:rPr>
+        <w:t xml:space="preserve"> 2 </w:t>
+      </w:r>
+      <w:r>
+        <w:rPr>
+          <w:rFonts w:ascii="Consolas" w:eastAsia="Consolas" w:hAnsi="Consolas" w:cs="Consolas"/>
+          <w:sz w:val="18"/>
+          <w:szCs w:val="18"/>
+        </w:rPr>
+        <w:t>дня</w:t>
+      </w:r>
+      <w:r>
+        <w:rPr>
+          <w:rFonts w:ascii="Consolas" w:eastAsia="Consolas" w:hAnsi="Consolas" w:cs="Consolas"/>
+          <w:sz w:val="18"/>
+          <w:szCs w:val="18"/>
+          <w:lang w:val="en-US"/>
+        </w:rPr>
+        <w:t>');</w:t>
+      </w:r>
+    </w:p>
+    <w:p>
+      <w:pPr>
+        <w:shd w:val="clear" w:color="auto" w:fill="F2F2F2"/>
+        <w:ind w:left="240"/>
+        <w:rPr>
+          <w:lang w:val="en-US"/>
+        </w:rPr>
+      </w:pPr>
+      <w:r>
+        <w:rPr>
+          <w:rFonts w:ascii="Consolas" w:eastAsia="Consolas" w:hAnsi="Consolas" w:cs="Consolas"/>
+          <w:sz w:val="18"/>
+          <w:szCs w:val="18"/>
+          <w:lang w:val="en-US"/>
+        </w:rPr>
+        <w:t xml:space="preserve">  }</w:t>
+      </w:r>
+    </w:p>
+    <w:p>
+      <w:pPr>
+        <w:shd w:val="clear" w:color="auto" w:fill="F2F2F2"/>
+        <w:ind w:left="240"/>
+        <w:rPr>
+          <w:lang w:val="en-US"/>
+        </w:rPr>
+      </w:pPr>
+      <w:r>
+        <w:rPr>
+          <w:rFonts w:ascii="Consolas" w:eastAsia="Consolas" w:hAnsi="Consolas" w:cs="Consolas"/>
+          <w:sz w:val="18"/>
+          <w:szCs w:val="18"/>
+          <w:lang w:val="en-US"/>
+        </w:rPr>
+        <w:t xml:space="preserve">  const key = `${item.id</w:t>
+      </w:r>
+      <w:proofErr w:type="gramStart"/>
+      <w:r>
+        <w:rPr>
+          <w:rFonts w:ascii="Consolas" w:eastAsia="Consolas" w:hAnsi="Consolas" w:cs="Consolas"/>
+          <w:sz w:val="18"/>
+          <w:szCs w:val="18"/>
+          <w:lang w:val="en-US"/>
+        </w:rPr>
+        <w:t>}:$</w:t>
+      </w:r>
+      <w:proofErr w:type="gramEnd"/>
+      <w:r>
+        <w:rPr>
+          <w:rFonts w:ascii="Consolas" w:eastAsia="Consolas" w:hAnsi="Consolas" w:cs="Consolas"/>
+          <w:sz w:val="18"/>
+          <w:szCs w:val="18"/>
+          <w:lang w:val="en-US"/>
+        </w:rPr>
+        <w:t>{item.period}:${deliveryDate.toISOString().slice(0, 10)}`;</w:t>
+      </w:r>
+    </w:p>
+    <w:p>
+      <w:pPr>
+        <w:shd w:val="clear" w:color="auto" w:fill="F2F2F2"/>
+        <w:ind w:left="240"/>
+        <w:rPr>
+          <w:lang w:val="en-US"/>
+        </w:rPr>
+      </w:pPr>
+      <w:r>
+        <w:rPr>
+          <w:rFonts w:ascii="Consolas" w:eastAsia="Consolas" w:hAnsi="Consolas" w:cs="Consolas"/>
+          <w:sz w:val="18"/>
+          <w:szCs w:val="18"/>
+          <w:lang w:val="en-US"/>
+        </w:rPr>
+        <w:t xml:space="preserve">  const existing = </w:t>
+      </w:r>
+      <w:proofErr w:type="gramStart"/>
+      <w:r>
+        <w:rPr>
+          <w:rFonts w:ascii="Consolas" w:eastAsia="Consolas" w:hAnsi="Consolas" w:cs="Consolas"/>
+          <w:sz w:val="18"/>
+          <w:szCs w:val="18"/>
+          <w:lang w:val="en-US"/>
+        </w:rPr>
+        <w:t>cart.find</w:t>
+      </w:r>
+      <w:proofErr w:type="gramEnd"/>
+      <w:r>
+        <w:rPr>
+          <w:rFonts w:ascii="Consolas" w:eastAsia="Consolas" w:hAnsi="Consolas" w:cs="Consolas"/>
+          <w:sz w:val="18"/>
+          <w:szCs w:val="18"/>
+          <w:lang w:val="en-US"/>
+        </w:rPr>
+        <w:t>((l) =&gt; l.key === key);</w:t>
+      </w:r>
+    </w:p>
+    <w:p>
+      <w:pPr>
+        <w:shd w:val="clear" w:color="auto" w:fill="F2F2F2"/>
+        <w:ind w:left="240"/>
+        <w:rPr>
+          <w:lang w:val="en-US"/>
+        </w:rPr>
+      </w:pPr>
+      <w:r>
+        <w:rPr>
+          <w:rFonts w:ascii="Consolas" w:eastAsia="Consolas" w:hAnsi="Consolas" w:cs="Consolas"/>
+          <w:sz w:val="18"/>
+          <w:szCs w:val="18"/>
+          <w:lang w:val="en-US"/>
+        </w:rPr>
+        <w:t xml:space="preserve">  if (existing) return cart.map((l) =&gt; (l.key === </w:t>
+      </w:r>
+      <w:proofErr w:type="gramStart"/>
+      <w:r>
+        <w:rPr>
+          <w:rFonts w:ascii="Consolas" w:eastAsia="Consolas" w:hAnsi="Consolas" w:cs="Consolas"/>
+          <w:sz w:val="18"/>
+          <w:szCs w:val="18"/>
+          <w:lang w:val="en-US"/>
+        </w:rPr>
+        <w:t>key ?</w:t>
+      </w:r>
+      <w:proofErr w:type="gramEnd"/>
+      <w:r>
+        <w:rPr>
+          <w:rFonts w:ascii="Consolas" w:eastAsia="Consolas" w:hAnsi="Consolas" w:cs="Consolas"/>
+          <w:sz w:val="18"/>
+          <w:szCs w:val="18"/>
+          <w:lang w:val="en-US"/>
+        </w:rPr>
+        <w:t xml:space="preserve"> </w:t>
+      </w:r>
+      <w:proofErr w:type="gramStart"/>
+      <w:r>
+        <w:rPr>
+          <w:rFonts w:ascii="Consolas" w:eastAsia="Consolas" w:hAnsi="Consolas" w:cs="Consolas"/>
+          <w:sz w:val="18"/>
+          <w:szCs w:val="18"/>
+          <w:lang w:val="en-US"/>
+        </w:rPr>
+        <w:t>{ ...</w:t>
+      </w:r>
+      <w:proofErr w:type="gramEnd"/>
+      <w:r>
+        <w:rPr>
+          <w:rFonts w:ascii="Consolas" w:eastAsia="Consolas" w:hAnsi="Consolas" w:cs="Consolas"/>
+          <w:sz w:val="18"/>
+          <w:szCs w:val="18"/>
+          <w:lang w:val="en-US"/>
+        </w:rPr>
+        <w:t>l, qty: l.qty + 1 } : l));</w:t>
+      </w:r>
+    </w:p>
+    <w:p>
+      <w:pPr>
+        <w:shd w:val="clear" w:color="auto" w:fill="F2F2F2"/>
+        <w:ind w:left="240"/>
+        <w:rPr>
+          <w:lang w:val="en-US"/>
+        </w:rPr>
+      </w:pPr>
+      <w:r>
+        <w:rPr>
+          <w:rFonts w:ascii="Consolas" w:eastAsia="Consolas" w:hAnsi="Consolas" w:cs="Consolas"/>
+          <w:sz w:val="18"/>
+          <w:szCs w:val="18"/>
+          <w:lang w:val="en-US"/>
+        </w:rPr>
+        <w:t xml:space="preserve">  return [...cart, </w:t>
+      </w:r>
+      <w:proofErr w:type="gramStart"/>
+      <w:r>
+        <w:rPr>
+          <w:rFonts w:ascii="Consolas" w:eastAsia="Consolas" w:hAnsi="Consolas" w:cs="Consolas"/>
+          <w:sz w:val="18"/>
+          <w:szCs w:val="18"/>
+          <w:lang w:val="en-US"/>
+        </w:rPr>
+        <w:t>{ key</w:t>
+      </w:r>
+      <w:proofErr w:type="gramEnd"/>
+      <w:r>
+        <w:rPr>
+          <w:rFonts w:ascii="Consolas" w:eastAsia="Consolas" w:hAnsi="Consolas" w:cs="Consolas"/>
+          <w:sz w:val="18"/>
+          <w:szCs w:val="18"/>
+          <w:lang w:val="en-US"/>
+        </w:rPr>
+        <w:t>, ...item, deliveryDate, qty: 1 }];</w:t>
+      </w:r>
+    </w:p>
+    <w:p>
+      <w:pPr>
+        <w:shd w:val="clear" w:color="auto" w:fill="F2F2F2"/>
+        <w:ind w:left="240"/>
+      </w:pPr>
+      <w:r>
+        <w:rPr>
+          <w:rFonts w:ascii="Consolas" w:eastAsia="Consolas" w:hAnsi="Consolas" w:cs="Consolas"/>
+          <w:sz w:val="18"/>
+          <w:szCs w:val="18"/>
         </w:rPr>
         <w:t>}</w:t>
       </w:r>
@@ -5517,13 +5847,23 @@
       <w:r>
         <w:t xml:space="preserve">В демо-версии ключ позиции строится через </w:t>
       </w:r>
+      <w:proofErr w:type="gramStart"/>
       <w:r>
         <w:rPr>
           <w:rFonts w:ascii="Consolas" w:eastAsia="Consolas" w:hAnsi="Consolas" w:cs="Consolas"/>
           <w:sz w:val="20"/>
           <w:szCs w:val="20"/>
         </w:rPr>
-        <w:t>toISOString()</w:t>
+        <w:t>toISOString(</w:t>
+      </w:r>
+      <w:proofErr w:type="gramEnd"/>
+      <w:r>
+        <w:rPr>
+          <w:rFonts w:ascii="Consolas" w:eastAsia="Consolas" w:hAnsi="Consolas" w:cs="Consolas"/>
+          <w:sz w:val="20"/>
+          <w:szCs w:val="20"/>
+        </w:rPr>
+        <w:t>)</w:t>
       </w:r>
       <w:r>
         <w:t xml:space="preserve">, который переводит дату в UTC. В часовых поясах восточнее UTC это может сдвинуть дату на предыдущий день. Поэтому в основном проекте (ДЗ 4, </w:t>
@@ -5687,18 +6027,47 @@
             </w:tcMar>
           </w:tcPr>
           <w:p>
+            <w:pPr>
+              <w:rPr>
+                <w:lang w:val="en-US"/>
+              </w:rPr>
+            </w:pPr>
             <w:r>
               <w:rPr>
                 <w:sz w:val="20"/>
                 <w:szCs w:val="20"/>
               </w:rPr>
-              <w:t xml:space="preserve">Для чтения </w:t>
+              <w:t>Для</w:t>
+            </w:r>
+            <w:r>
+              <w:rPr>
+                <w:sz w:val="20"/>
+                <w:szCs w:val="20"/>
+                <w:lang w:val="en-US"/>
+              </w:rPr>
+              <w:t xml:space="preserve"> </w:t>
+            </w:r>
+            <w:r>
+              <w:rPr>
+                <w:sz w:val="20"/>
+                <w:szCs w:val="20"/>
+              </w:rPr>
+              <w:t>чтения</w:t>
+            </w:r>
+            <w:r>
+              <w:rPr>
+                <w:sz w:val="20"/>
+                <w:szCs w:val="20"/>
+                <w:lang w:val="en-US"/>
+              </w:rPr>
+              <w:t xml:space="preserve"> </w:t>
             </w:r>
             <w:r>
               <w:rPr>
                 <w:rFonts w:ascii="Consolas" w:eastAsia="Consolas" w:hAnsi="Consolas" w:cs="Consolas"/>
                 <w:sz w:val="18"/>
                 <w:szCs w:val="18"/>
+                <w:lang w:val="en-US"/>
               </w:rPr>
               <w:t>.docx</w:t>
             </w:r>
@@ -5706,14 +6075,46 @@
               <w:rPr>
                 <w:sz w:val="20"/>
                 <w:szCs w:val="20"/>
-              </w:rPr>
-              <w:t xml:space="preserve"> использован PowerShell и .NET (</w:t>
+                <w:lang w:val="en-US"/>
+              </w:rPr>
+              <w:t xml:space="preserve"> </w:t>
+            </w:r>
+            <w:r>
+              <w:rPr>
+                <w:sz w:val="20"/>
+                <w:szCs w:val="20"/>
+              </w:rPr>
+              <w:t>использован</w:t>
+            </w:r>
+            <w:r>
+              <w:rPr>
+                <w:sz w:val="20"/>
+                <w:szCs w:val="20"/>
+                <w:lang w:val="en-US"/>
+              </w:rPr>
+              <w:t xml:space="preserve"> PowerShell </w:t>
+            </w:r>
+            <w:r>
+              <w:rPr>
+                <w:sz w:val="20"/>
+                <w:szCs w:val="20"/>
+              </w:rPr>
+              <w:t>и</w:t>
+            </w:r>
+            <w:r>
+              <w:rPr>
+                <w:sz w:val="20"/>
+                <w:szCs w:val="20"/>
+                <w:lang w:val="en-US"/>
+              </w:rPr>
+              <w:t xml:space="preserve"> .NET (</w:t>
             </w:r>
             <w:r>
               <w:rPr>
                 <w:rFonts w:ascii="Consolas" w:eastAsia="Consolas" w:hAnsi="Consolas" w:cs="Consolas"/>
                 <w:sz w:val="18"/>
                 <w:szCs w:val="18"/>
+                <w:lang w:val="en-US"/>
               </w:rPr>
               <w:t>System.IO.Compression</w:t>
             </w:r>
@@ -5721,6 +6122,7 @@
               <w:rPr>
                 <w:sz w:val="20"/>
                 <w:szCs w:val="20"/>
+                <w:lang w:val="en-US"/>
               </w:rPr>
               <w:t>)</w:t>
             </w:r>
@@ -5983,7 +6385,11 @@
         <w:t>CLAUDE.md</w:t>
       </w:r>
       <w:r>
-        <w:t xml:space="preserve"> или </w:t>
+        <w:t xml:space="preserve"> </w:t>
+      </w:r>
+      <w:proofErr w:type="gramStart"/>
+      <w:r>
+        <w:t xml:space="preserve">или </w:t>
       </w:r>
       <w:r>
         <w:rPr>
@@ -5993,6 +6399,7 @@
         </w:rPr>
         <w:t>.cursorrules</w:t>
       </w:r>
+      <w:proofErr w:type="gramEnd"/>
       <w:r>
         <w:t>): это заметно повышает предсказуемость результата (подтверждено в ДЗ 2).</w:t>
       </w:r>
@@ -6018,7 +6425,11 @@
         </w:numPr>
       </w:pPr>
       <w:r>
-        <w:t xml:space="preserve">Не передавать агенту ключи и персональные данные; секреты хранить только в </w:t>
+        <w:t xml:space="preserve">Не передавать агенту ключи и персональные данные; секреты хранить только </w:t>
+      </w:r>
+      <w:proofErr w:type="gramStart"/>
+      <w:r>
+        <w:t xml:space="preserve">в </w:t>
       </w:r>
       <w:r>
         <w:rPr>
@@ -6028,6 +6439,7 @@
         </w:rPr>
         <w:t>.env</w:t>
       </w:r>
+      <w:proofErr w:type="gramEnd"/>
       <w:r>
         <w:t xml:space="preserve">, а в репозиторий добавлять </w:t>
       </w:r>
@@ -6069,33 +6481,8 @@
     </w:p>
     <w:p>
       <w:pPr>
-        <w:pStyle w:val="1"/>
-        <w:spacing w:before="240" w:after="120"/>
-      </w:pPr>
-      <w:bookmarkStart w:id="28" w:name="_Toc242635840"/>
-      <w:r>
-        <w:t>7. Демонстрация работы</w:t>
-      </w:r>
-      <w:bookmarkEnd w:id="28"/>
-    </w:p>
-    <w:p>
-      <w:pPr>
         <w:spacing w:after="120"/>
       </w:pPr>
-      <w:r>
-        <w:t xml:space="preserve">Код тестового проекта: папка </w:t>
-      </w:r>
-      <w:r>
-        <w:rPr>
-          <w:rFonts w:ascii="Consolas" w:eastAsia="Consolas" w:hAnsi="Consolas" w:cs="Consolas"/>
-          <w:sz w:val="20"/>
-          <w:szCs w:val="20"/>
-        </w:rPr>
-        <w:t>hw1/demo</w:t>
-      </w:r>
-      <w:r>
-        <w:t>. Вывод запуска тестов приведён в разделе 4. Ссылка на репозиторий GitHub не создавалась: для этого нужен аккаунт пользователя.</w:t>
-      </w:r>
     </w:p>
     <w:sectPr>
       <w:footerReference w:type="default" r:id="rId7"/>

</xml_diff>